<commit_message>
feat(resume): full career timeline 2005–2026
- Hospitality years (2005–2011), ADA .NET work, Agenciauto
- Own hospitality business as Founder & General Manager (2013–2020)
- The Charlee, CarNow, Major Media; dates re-sequenced so nothing overlaps
  except roles marked as concurrent
- 15+ years in tech / 20+ total on the CV, portfolio and LinkedIn kit
- Projects moved to the sidebar to keep every PDF at 3 pages

Co-Authored-By: Claude Opus 5.5 <noreply@anthropic.com>
Claude-Session: https://claude.ai/code/session_01LBMvfUQ6YDGZ1wc9D6Yjrn
</commit_message>
<xml_diff>
--- a/public/cv/David-Gomez-Hoja-de-Vida-ES.docx
+++ b/public/cv/David-Gomez-Hoja-de-Vida-ES.docx
@@ -37,7 +37,7 @@
         </w:rPr>
         <w:t xml:space="preserve">Medellín, Colombia · Disponible remoto e híbrido  |  +57 317 853 0602  |  </w:t>
       </w:r>
-      <w:hyperlink w:history="1" r:id="rIdsmg0kzpcf3twxtwczbpkf">
+      <w:hyperlink w:history="1" r:id="rIdzpv1oo20jaht9qdum05to">
         <w:r>
           <w:rPr>
             <w:rStyle w:val="Hyperlink"/>
@@ -49,7 +49,7 @@
       </w:hyperlink>
     </w:p>
     <w:p>
-      <w:hyperlink w:history="1" r:id="rId_xxq3zh0ysmy7taqjmqs1">
+      <w:hyperlink w:history="1" r:id="rIdpddacir4m_4e4g-tzzkiv">
         <w:r>
           <w:rPr>
             <w:rStyle w:val="Hyperlink"/>
@@ -67,7 +67,7 @@
         </w:rPr>
         <w:t xml:space="preserve">  |  </w:t>
       </w:r>
-      <w:hyperlink w:history="1" r:id="rIdbzm7ofuiezndrkzbhuxhu">
+      <w:hyperlink w:history="1" r:id="rIdqhsrfw_408ranwnluguel">
         <w:r>
           <w:rPr>
             <w:rStyle w:val="Hyperlink"/>
@@ -85,7 +85,7 @@
         </w:rPr>
         <w:t xml:space="preserve">  |  </w:t>
       </w:r>
-      <w:hyperlink w:history="1" r:id="rIdw_2askgih58kffg5s_0sj">
+      <w:hyperlink w:history="1" r:id="rId1qc4dmjqpive6x868lxfn">
         <w:r>
           <w:rPr>
             <w:rStyle w:val="Hyperlink"/>
@@ -125,7 +125,24 @@
           <w:sz w:val="20"/>
           <w:szCs w:val="20"/>
         </w:rPr>
-        <w:t xml:space="preserve">Ingeniero full-stack senior con más de 10 años en desarrollo de software, operación de plataformas cloud, sistemas de TI, datos y automatización. Llevo productos desde un repositorio vacío hasta producción — arquitectura, backend, frontend, móvil, pagos e infraestructura — y construyo la automatización con IA a su alrededor. Trabajo con PHP/Laravel, React/TypeScript, Node.js, Python, PostgreSQL, AWS, Azure, Cloudflare, Docker y Terraform; documento decisiones, automatizo pruebas y despliego por etapas. Bilingüe inglés/español, con experiencia remota en equipos internacionales.</w:t>
+        <w:t xml:space="preserve">Ingeniero full-stack senior con más de 15 años en software y TI — y más de 20 años de trayectoria que incluye fundar y dirigir mi propio negocio hotelero. Llevo productos desde un repositorio vacío hasta producción — arquitectura, backend, frontend, móvil, pagos e infraestructura — y construyo la automatización con IA a su alrededor. Trabajo con PHP/Laravel, React/TypeScript, Node.js, Python, PostgreSQL, AWS, Azure, Cloudflare, Docker y Terraform. Haber dirigido un negocio completo me hace construir pensando en la operación, el cliente y los márgenes. Bilingüe inglés/español, con experiencia remota en equipos internacionales.</w:t>
+      </w:r>
+    </w:p>
+    <w:p>
+      <w:pPr>
+        <w:pStyle w:val="ListParagraph"/>
+        <w:numPr>
+          <w:ilvl w:val="0"/>
+          <w:numId w:val="2"/>
+        </w:numPr>
+        <w:spacing w:after="30"/>
+      </w:pPr>
+      <w:r>
+        <w:rPr>
+          <w:sz w:val="20"/>
+          <w:szCs w:val="20"/>
+        </w:rPr>
+        <w:t xml:space="preserve">Fundé y dirigí un negocio hotelero de 7 propiedades (2013 – 2020): operación, marca, marketing, finanzas y su propio sistema de reservas</w:t>
       </w:r>
     </w:p>
     <w:p>
@@ -160,23 +177,6 @@
           <w:szCs w:val="20"/>
         </w:rPr>
         <w:t xml:space="preserve">Pagos con Wompi, PayU y ePayco bajo un mismo patrón: webhooks firmados, idempotencia y libro contable de solo inserción</w:t>
-      </w:r>
-    </w:p>
-    <w:p>
-      <w:pPr>
-        <w:pStyle w:val="ListParagraph"/>
-        <w:numPr>
-          <w:ilvl w:val="0"/>
-          <w:numId w:val="2"/>
-        </w:numPr>
-        <w:spacing w:after="30"/>
-      </w:pPr>
-      <w:r>
-        <w:rPr>
-          <w:sz w:val="20"/>
-          <w:szCs w:val="20"/>
-        </w:rPr>
-        <w:t xml:space="preserve">14 sitios de clientes en línea hoy en salud, hotelería, reclutamiento, finanzas, educación y sin ánimo de lucro</w:t>
       </w:r>
     </w:p>
     <w:p>
@@ -353,6 +353,27 @@
           <w:sz w:val="20"/>
           <w:szCs w:val="20"/>
         </w:rPr>
+        <w:t xml:space="preserve">Negocio y operación: </w:t>
+      </w:r>
+      <w:r>
+        <w:rPr>
+          <w:sz w:val="20"/>
+          <w:szCs w:val="20"/>
+        </w:rPr>
+        <w:t xml:space="preserve">General management, Hotel operations, Airbnb / Booking.com, Team leadership, Brand &amp; marketing, Administration &amp; finance</w:t>
+      </w:r>
+    </w:p>
+    <w:p>
+      <w:pPr>
+        <w:spacing w:after="30"/>
+      </w:pPr>
+      <w:r>
+        <w:rPr>
+          <w:b/>
+          <w:bCs/>
+          <w:sz w:val="20"/>
+          <w:szCs w:val="20"/>
+        </w:rPr>
         <w:t xml:space="preserve">Entrega: </w:t>
       </w:r>
       <w:r>
@@ -471,23 +492,6 @@
           <w:sz w:val="20"/>
           <w:szCs w:val="20"/>
         </w:rPr>
-        <w:t xml:space="preserve">Hice imposibles las reservas dobles y los partidos sobrevendidos desde la base de datos (restricciones EXCLUDE, índices únicos y advisory locks en PostgreSQL) y respaldé cada sistema con pruebas de BD, integración y end-to-end.</w:t>
-      </w:r>
-    </w:p>
-    <w:p>
-      <w:pPr>
-        <w:pStyle w:val="ListParagraph"/>
-        <w:numPr>
-          <w:ilvl w:val="0"/>
-          <w:numId w:val="2"/>
-        </w:numPr>
-        <w:spacing w:after="30"/>
-      </w:pPr>
-      <w:r>
-        <w:rPr>
-          <w:sz w:val="20"/>
-          <w:szCs w:val="20"/>
-        </w:rPr>
         <w:t xml:space="preserve">Trabajo con un proceso potenciado con IA: decisiones de arquitectura escritas primero, agentes de código dentro de controles automáticos (tipos, lint, unitarias, BD, E2E, accesibilidad, CSP), revisión humana y despliegues por etapas.</w:t>
       </w:r>
     </w:p>
@@ -529,7 +533,7 @@
           <w:sz w:val="19"/>
           <w:szCs w:val="19"/>
         </w:rPr>
-        <w:t xml:space="preserve">	jun 2026 – sep 2026</w:t>
+        <w:t xml:space="preserve">	may 2026 – sep 2026</w:t>
       </w:r>
     </w:p>
     <w:p>
@@ -627,7 +631,7 @@
           <w:sz w:val="21"/>
           <w:szCs w:val="21"/>
         </w:rPr>
-        <w:t xml:space="preserve">Technical Writer y Desarrollador — Fiserv</w:t>
+        <w:t xml:space="preserve">Desarrollador Full-Stack — WordPress (Contrato) — Major Media</w:t>
       </w:r>
       <w:r>
         <w:rPr>
@@ -635,72 +639,38 @@
           <w:sz w:val="19"/>
           <w:szCs w:val="19"/>
         </w:rPr>
-        <w:t xml:space="preserve">	ene 2026 – jun 2026</w:t>
-      </w:r>
-    </w:p>
-    <w:p>
-      <w:pPr>
-        <w:keepNext/>
-        <w:spacing w:after="40"/>
-      </w:pPr>
-      <w:r>
-        <w:rPr>
-          <w:color w:val="52525B"/>
-          <w:sz w:val="18"/>
-          <w:szCs w:val="18"/>
-        </w:rPr>
-        <w:t xml:space="preserve">Remoto</w:t>
-      </w:r>
-    </w:p>
-    <w:p>
-      <w:pPr>
-        <w:pStyle w:val="ListParagraph"/>
-        <w:numPr>
-          <w:ilvl w:val="0"/>
-          <w:numId w:val="2"/>
-        </w:numPr>
-        <w:spacing w:after="30"/>
-      </w:pPr>
-      <w:r>
-        <w:rPr>
-          <w:sz w:val="20"/>
-          <w:szCs w:val="20"/>
-        </w:rPr>
-        <w:t xml:space="preserve">Apoyé la plataforma Vision Next con documentación técnica y de APIs para desarrolladores sobre flujos de sistemas financieros.</w:t>
-      </w:r>
-    </w:p>
-    <w:p>
-      <w:pPr>
-        <w:pStyle w:val="ListParagraph"/>
-        <w:numPr>
-          <w:ilvl w:val="0"/>
-          <w:numId w:val="2"/>
-        </w:numPr>
-        <w:spacing w:after="30"/>
-      </w:pPr>
-      <w:r>
-        <w:rPr>
-          <w:sz w:val="20"/>
-          <w:szCs w:val="20"/>
-        </w:rPr>
-        <w:t xml:space="preserve">Analicé APIs REST con Swagger/OpenAPI, documentando endpoints, autenticación, modelos de request/response, códigos de estado y manejo de errores.</w:t>
-      </w:r>
-    </w:p>
-    <w:p>
-      <w:pPr>
-        <w:pStyle w:val="ListParagraph"/>
-        <w:numPr>
-          <w:ilvl w:val="0"/>
-          <w:numId w:val="2"/>
-        </w:numPr>
-        <w:spacing w:after="30"/>
-      </w:pPr>
-      <w:r>
-        <w:rPr>
-          <w:sz w:val="20"/>
-          <w:szCs w:val="20"/>
-        </w:rPr>
-        <w:t xml:space="preserve">Creé plantillas reutilizables de documentación en Markdown y trabajé con los equipos de ingeniería en arquitectura, integraciones, runbooks y guías para desarrolladores.</w:t>
+        <w:t xml:space="preserve">	2026 · varios meses</w:t>
+      </w:r>
+    </w:p>
+    <w:p>
+      <w:pPr>
+        <w:keepNext/>
+        <w:spacing w:after="40"/>
+      </w:pPr>
+      <w:r>
+        <w:rPr>
+          <w:color w:val="52525B"/>
+          <w:sz w:val="18"/>
+          <w:szCs w:val="18"/>
+        </w:rPr>
+        <w:t xml:space="preserve">Remoto · proyecto en paralelo</w:t>
+      </w:r>
+    </w:p>
+    <w:p>
+      <w:pPr>
+        <w:pStyle w:val="ListParagraph"/>
+        <w:numPr>
+          <w:ilvl w:val="0"/>
+          <w:numId w:val="2"/>
+        </w:numPr>
+        <w:spacing w:after="30"/>
+      </w:pPr>
+      <w:r>
+        <w:rPr>
+          <w:sz w:val="20"/>
+          <w:szCs w:val="20"/>
+        </w:rPr>
+        <w:t xml:space="preserve">Desarrollo full-stack para los sitios de clientes de una agencia: temas y plugins de WordPress a la medida, integraciones, rendimiento y mantenimiento.</w:t>
       </w:r>
     </w:p>
     <w:p>
@@ -715,7 +685,7 @@
           <w:sz w:val="18"/>
           <w:szCs w:val="18"/>
         </w:rPr>
-        <w:t xml:space="preserve">REST APIs · Swagger / OpenAPI · Markdown · Docs-as-code</w:t>
+        <w:t xml:space="preserve">WordPress · PHP · JavaScript · Performance</w:t>
       </w:r>
     </w:p>
     <w:p>
@@ -733,7 +703,7 @@
           <w:sz w:val="21"/>
           <w:szCs w:val="21"/>
         </w:rPr>
-        <w:t xml:space="preserve">Provisioning Manager — Infraestructura de TI y Accesos — Steward</w:t>
+        <w:t xml:space="preserve">Desarrollador Full-Stack y Technical Writer de APIs — Fiserv</w:t>
       </w:r>
       <w:r>
         <w:rPr>
@@ -741,7 +711,7 @@
           <w:sz w:val="19"/>
           <w:szCs w:val="19"/>
         </w:rPr>
-        <w:t xml:space="preserve">	nov 2023 – nov 2025</w:t>
+        <w:t xml:space="preserve">	ene 2026 – abr 2026</w:t>
       </w:r>
     </w:p>
     <w:p>
@@ -772,41 +742,24 @@
           <w:sz w:val="20"/>
           <w:szCs w:val="20"/>
         </w:rPr>
-        <w:t xml:space="preserve">Gestioné el aprovisionamiento y los accesos de TI en Google Workspace, Okta y MDM para equipos macOS y Windows.</w:t>
-      </w:r>
-    </w:p>
-    <w:p>
-      <w:pPr>
-        <w:pStyle w:val="ListParagraph"/>
-        <w:numPr>
-          <w:ilvl w:val="0"/>
-          <w:numId w:val="2"/>
-        </w:numPr>
-        <w:spacing w:after="30"/>
-      </w:pPr>
-      <w:r>
-        <w:rPr>
-          <w:sz w:val="20"/>
-          <w:szCs w:val="20"/>
-        </w:rPr>
-        <w:t xml:space="preserve">Construí dashboards internos en React/Node.js para monitorear la asignación de recursos y apoyé iniciativas de infraestructura en AWS.</w:t>
-      </w:r>
-    </w:p>
-    <w:p>
-      <w:pPr>
-        <w:pStyle w:val="ListParagraph"/>
-        <w:numPr>
-          <w:ilvl w:val="0"/>
-          <w:numId w:val="2"/>
-        </w:numPr>
-        <w:spacing w:after="30"/>
-      </w:pPr>
-      <w:r>
-        <w:rPr>
-          <w:sz w:val="20"/>
-          <w:szCs w:val="20"/>
-        </w:rPr>
-        <w:t xml:space="preserve">Escribí SOPs, capacité al personal y coordiné procesos de aprovisionamiento, infraestructura y gestión de accesos entre equipos.</w:t>
+        <w:t xml:space="preserve">Apoyé la plataforma Vision Next con documentación técnica y de APIs para desarrolladores sobre flujos de sistemas financieros.</w:t>
+      </w:r>
+    </w:p>
+    <w:p>
+      <w:pPr>
+        <w:pStyle w:val="ListParagraph"/>
+        <w:numPr>
+          <w:ilvl w:val="0"/>
+          <w:numId w:val="2"/>
+        </w:numPr>
+        <w:spacing w:after="30"/>
+      </w:pPr>
+      <w:r>
+        <w:rPr>
+          <w:sz w:val="20"/>
+          <w:szCs w:val="20"/>
+        </w:rPr>
+        <w:t xml:space="preserve">Analicé APIs REST con Swagger/OpenAPI, documentando endpoints, autenticación, modelos de request/response, códigos de estado y manejo de errores.</w:t>
       </w:r>
     </w:p>
     <w:p>
@@ -821,7 +774,7 @@
           <w:sz w:val="18"/>
           <w:szCs w:val="18"/>
         </w:rPr>
-        <w:t xml:space="preserve">Google Workspace · Okta · MDM · React · Node.js · AWS</w:t>
+        <w:t xml:space="preserve">REST APIs · Swagger / OpenAPI · Markdown · Docs-as-code</w:t>
       </w:r>
     </w:p>
     <w:p>
@@ -839,7 +792,7 @@
           <w:sz w:val="21"/>
           <w:szCs w:val="21"/>
         </w:rPr>
-        <w:t xml:space="preserve">Desarrollador Full-Stack y Líder de Equipo — Virtual Latinos</w:t>
+        <w:t xml:space="preserve">Provisioning Manager — Infraestructura de TI y Accesos — Steward</w:t>
       </w:r>
       <w:r>
         <w:rPr>
@@ -847,89 +800,72 @@
           <w:sz w:val="19"/>
           <w:szCs w:val="19"/>
         </w:rPr>
-        <w:t xml:space="preserve">	ene 2025 – jun 2025</w:t>
-      </w:r>
-    </w:p>
-    <w:p>
-      <w:pPr>
-        <w:keepNext/>
-        <w:spacing w:after="40"/>
-      </w:pPr>
-      <w:r>
-        <w:rPr>
-          <w:color w:val="52525B"/>
-          <w:sz w:val="18"/>
-          <w:szCs w:val="18"/>
-        </w:rPr>
-        <w:t xml:space="preserve">Remoto · proyecto en paralelo</w:t>
-      </w:r>
-    </w:p>
-    <w:p>
-      <w:pPr>
-        <w:pStyle w:val="ListParagraph"/>
-        <w:numPr>
-          <w:ilvl w:val="0"/>
-          <w:numId w:val="2"/>
-        </w:numPr>
-        <w:spacing w:after="30"/>
-      </w:pPr>
-      <w:r>
-        <w:rPr>
-          <w:sz w:val="20"/>
-          <w:szCs w:val="20"/>
-        </w:rPr>
-        <w:t xml:space="preserve">Lideré el desarrollo full-stack con React, Redux, TypeScript, Laravel y PostgreSQL para la plataforma de gestión y reclutamiento de asistentes virtuales.</w:t>
-      </w:r>
-    </w:p>
-    <w:p>
-      <w:pPr>
-        <w:pStyle w:val="ListParagraph"/>
-        <w:numPr>
-          <w:ilvl w:val="0"/>
-          <w:numId w:val="2"/>
-        </w:numPr>
-        <w:spacing w:after="30"/>
-      </w:pPr>
-      <w:r>
-        <w:rPr>
-          <w:sz w:val="20"/>
-          <w:szCs w:val="20"/>
-        </w:rPr>
-        <w:t xml:space="preserve">Construí y optimicé APIs REST y automaticé operaciones con HubSpot, Zapier y GoHighLevel — pipelines de leads, seguimientos, formularios y calendarios — reduciendo el trabajo manual en un 40%.</w:t>
-      </w:r>
-    </w:p>
-    <w:p>
-      <w:pPr>
-        <w:pStyle w:val="ListParagraph"/>
-        <w:numPr>
-          <w:ilvl w:val="0"/>
-          <w:numId w:val="2"/>
-        </w:numPr>
-        <w:spacing w:after="30"/>
-      </w:pPr>
-      <w:r>
-        <w:rPr>
-          <w:sz w:val="20"/>
-          <w:szCs w:val="20"/>
-        </w:rPr>
-        <w:t xml:space="preserve">Dirigí la planeación de sprints, revisiones de código y mentorías; documenté APIs y procesos en Confluence, Swagger y Notion.</w:t>
-      </w:r>
-    </w:p>
-    <w:p>
-      <w:pPr>
-        <w:pStyle w:val="ListParagraph"/>
-        <w:numPr>
-          <w:ilvl w:val="0"/>
-          <w:numId w:val="2"/>
-        </w:numPr>
-        <w:spacing w:after="30"/>
-      </w:pPr>
-      <w:r>
-        <w:rPr>
-          <w:sz w:val="20"/>
-          <w:szCs w:val="20"/>
-        </w:rPr>
-        <w:t xml:space="preserve">Convertí diseños de Figma en páginas WordPress responsive y accesibles (Elementor, ACF, WooCommerce) optimizadas para Core Web Vitals.</w:t>
+        <w:t xml:space="preserve">	nov 2023 – nov 2025</w:t>
+      </w:r>
+    </w:p>
+    <w:p>
+      <w:pPr>
+        <w:keepNext/>
+        <w:spacing w:after="40"/>
+      </w:pPr>
+      <w:r>
+        <w:rPr>
+          <w:color w:val="52525B"/>
+          <w:sz w:val="18"/>
+          <w:szCs w:val="18"/>
+        </w:rPr>
+        <w:t xml:space="preserve">Remoto</w:t>
+      </w:r>
+    </w:p>
+    <w:p>
+      <w:pPr>
+        <w:pStyle w:val="ListParagraph"/>
+        <w:numPr>
+          <w:ilvl w:val="0"/>
+          <w:numId w:val="2"/>
+        </w:numPr>
+        <w:spacing w:after="30"/>
+      </w:pPr>
+      <w:r>
+        <w:rPr>
+          <w:sz w:val="20"/>
+          <w:szCs w:val="20"/>
+        </w:rPr>
+        <w:t xml:space="preserve">Gestioné el aprovisionamiento y los accesos de TI en Google Workspace, Okta y MDM para equipos macOS y Windows.</w:t>
+      </w:r>
+    </w:p>
+    <w:p>
+      <w:pPr>
+        <w:pStyle w:val="ListParagraph"/>
+        <w:numPr>
+          <w:ilvl w:val="0"/>
+          <w:numId w:val="2"/>
+        </w:numPr>
+        <w:spacing w:after="30"/>
+      </w:pPr>
+      <w:r>
+        <w:rPr>
+          <w:sz w:val="20"/>
+          <w:szCs w:val="20"/>
+        </w:rPr>
+        <w:t xml:space="preserve">Construí dashboards internos en React/Node.js para monitorear la asignación de recursos y apoyé iniciativas de infraestructura en AWS.</w:t>
+      </w:r>
+    </w:p>
+    <w:p>
+      <w:pPr>
+        <w:pStyle w:val="ListParagraph"/>
+        <w:numPr>
+          <w:ilvl w:val="0"/>
+          <w:numId w:val="2"/>
+        </w:numPr>
+        <w:spacing w:after="30"/>
+      </w:pPr>
+      <w:r>
+        <w:rPr>
+          <w:sz w:val="20"/>
+          <w:szCs w:val="20"/>
+        </w:rPr>
+        <w:t xml:space="preserve">Escribí SOPs, capacité al personal y coordiné procesos de aprovisionamiento, infraestructura y gestión de accesos entre equipos.</w:t>
       </w:r>
     </w:p>
     <w:p>
@@ -944,7 +880,7 @@
           <w:sz w:val="18"/>
           <w:szCs w:val="18"/>
         </w:rPr>
-        <w:t xml:space="preserve">React · Redux · TypeScript · Laravel · PostgreSQL · HubSpot · Zapier · WordPress</w:t>
+        <w:t xml:space="preserve">Google Workspace · Okta · MDM · React · Node.js · AWS</w:t>
       </w:r>
     </w:p>
     <w:p>
@@ -962,7 +898,7 @@
           <w:sz w:val="21"/>
           <w:szCs w:val="21"/>
         </w:rPr>
-        <w:t xml:space="preserve">Especialista SEO y Desarrollador Web (Contrato) — U.S.-based staffing company</w:t>
+        <w:t xml:space="preserve">Desarrollador Full-Stack y Líder de Equipo — Virtual Latinos</w:t>
       </w:r>
       <w:r>
         <w:rPr>
@@ -970,7 +906,7 @@
           <w:sz w:val="19"/>
           <w:szCs w:val="19"/>
         </w:rPr>
-        <w:t xml:space="preserve">	jul 2024 – oct 2024</w:t>
+        <w:t xml:space="preserve">	ene 2025 – jun 2025</w:t>
       </w:r>
     </w:p>
     <w:p>
@@ -1001,24 +937,41 @@
           <w:sz w:val="20"/>
           <w:szCs w:val="20"/>
         </w:rPr>
-        <w:t xml:space="preserve">Entregué sitios WordPress y HTML/CSS/JavaScript orientados a SEO, con schema markup, Google Analytics, Search Console y seguimiento de conversiones con Meta Pixel.</w:t>
-      </w:r>
-    </w:p>
-    <w:p>
-      <w:pPr>
-        <w:pStyle w:val="ListParagraph"/>
-        <w:numPr>
-          <w:ilvl w:val="0"/>
-          <w:numId w:val="2"/>
-        </w:numPr>
-        <w:spacing w:after="30"/>
-      </w:pPr>
-      <w:r>
-        <w:rPr>
-          <w:sz w:val="20"/>
-          <w:szCs w:val="20"/>
-        </w:rPr>
-        <w:t xml:space="preserve">Desarrollé plugins a la medida para automatizar leads e integrar el CRM, y administré servidores (cPanel, Linux), rendimiento y soporte en producción.</w:t>
+        <w:t xml:space="preserve">Lideré el desarrollo full-stack con React, Redux, TypeScript, Laravel y PostgreSQL para la plataforma de gestión y reclutamiento de asistentes virtuales.</w:t>
+      </w:r>
+    </w:p>
+    <w:p>
+      <w:pPr>
+        <w:pStyle w:val="ListParagraph"/>
+        <w:numPr>
+          <w:ilvl w:val="0"/>
+          <w:numId w:val="2"/>
+        </w:numPr>
+        <w:spacing w:after="30"/>
+      </w:pPr>
+      <w:r>
+        <w:rPr>
+          <w:sz w:val="20"/>
+          <w:szCs w:val="20"/>
+        </w:rPr>
+        <w:t xml:space="preserve">Construí y optimicé APIs REST y automaticé operaciones con HubSpot, Zapier y GoHighLevel — pipelines de leads, seguimientos, formularios y calendarios — reduciendo el trabajo manual en un 40%.</w:t>
+      </w:r>
+    </w:p>
+    <w:p>
+      <w:pPr>
+        <w:pStyle w:val="ListParagraph"/>
+        <w:numPr>
+          <w:ilvl w:val="0"/>
+          <w:numId w:val="2"/>
+        </w:numPr>
+        <w:spacing w:after="30"/>
+      </w:pPr>
+      <w:r>
+        <w:rPr>
+          <w:sz w:val="20"/>
+          <w:szCs w:val="20"/>
+        </w:rPr>
+        <w:t xml:space="preserve">Dirigí la planeación de sprints, revisiones de código y mentorías; documenté APIs y procesos en Confluence, Swagger y Notion.</w:t>
       </w:r>
     </w:p>
     <w:p>
@@ -1033,7 +986,7 @@
           <w:sz w:val="18"/>
           <w:szCs w:val="18"/>
         </w:rPr>
-        <w:t xml:space="preserve">WordPress · JavaScript · Technical SEO · Google Analytics · Linux</w:t>
+        <w:t xml:space="preserve">React · Redux · TypeScript · Laravel · PostgreSQL · HubSpot · Zapier · WordPress</w:t>
       </w:r>
     </w:p>
     <w:p>
@@ -1051,7 +1004,7 @@
           <w:sz w:val="21"/>
           <w:szCs w:val="21"/>
         </w:rPr>
-        <w:t xml:space="preserve">Especialista de TI y Desarrollador — SouthDesk</w:t>
+        <w:t xml:space="preserve">Especialista SEO y Desarrollador Web (Contrato) — U.S.-based staffing company</w:t>
       </w:r>
       <w:r>
         <w:rPr>
@@ -1059,55 +1012,55 @@
           <w:sz w:val="19"/>
           <w:szCs w:val="19"/>
         </w:rPr>
-        <w:t xml:space="preserve">	may 2023 – oct 2023</w:t>
-      </w:r>
-    </w:p>
-    <w:p>
-      <w:pPr>
-        <w:keepNext/>
-        <w:spacing w:after="40"/>
-      </w:pPr>
-      <w:r>
-        <w:rPr>
-          <w:color w:val="52525B"/>
-          <w:sz w:val="18"/>
-          <w:szCs w:val="18"/>
-        </w:rPr>
-        <w:t xml:space="preserve">Remoto</w:t>
-      </w:r>
-    </w:p>
-    <w:p>
-      <w:pPr>
-        <w:pStyle w:val="ListParagraph"/>
-        <w:numPr>
-          <w:ilvl w:val="0"/>
-          <w:numId w:val="2"/>
-        </w:numPr>
-        <w:spacing w:after="30"/>
-      </w:pPr>
-      <w:r>
-        <w:rPr>
-          <w:sz w:val="20"/>
-          <w:szCs w:val="20"/>
-        </w:rPr>
-        <w:t xml:space="preserve">Di soporte a los sistemas de TI y la operación diaria: soporte a usuarios, administración de sistemas y resolución de problemas.</w:t>
-      </w:r>
-    </w:p>
-    <w:p>
-      <w:pPr>
-        <w:pStyle w:val="ListParagraph"/>
-        <w:numPr>
-          <w:ilvl w:val="0"/>
-          <w:numId w:val="2"/>
-        </w:numPr>
-        <w:spacing w:after="30"/>
-      </w:pPr>
-      <w:r>
-        <w:rPr>
-          <w:sz w:val="20"/>
-          <w:szCs w:val="20"/>
-        </w:rPr>
-        <w:t xml:space="preserve">Construí y mantuve el sitio web de la empresa, responsive y enfocado en conversión, junto con otras tareas de desarrollo.</w:t>
+        <w:t xml:space="preserve">	jul 2024 – oct 2024</w:t>
+      </w:r>
+    </w:p>
+    <w:p>
+      <w:pPr>
+        <w:keepNext/>
+        <w:spacing w:after="40"/>
+      </w:pPr>
+      <w:r>
+        <w:rPr>
+          <w:color w:val="52525B"/>
+          <w:sz w:val="18"/>
+          <w:szCs w:val="18"/>
+        </w:rPr>
+        <w:t xml:space="preserve">Remoto · proyecto en paralelo</w:t>
+      </w:r>
+    </w:p>
+    <w:p>
+      <w:pPr>
+        <w:pStyle w:val="ListParagraph"/>
+        <w:numPr>
+          <w:ilvl w:val="0"/>
+          <w:numId w:val="2"/>
+        </w:numPr>
+        <w:spacing w:after="30"/>
+      </w:pPr>
+      <w:r>
+        <w:rPr>
+          <w:sz w:val="20"/>
+          <w:szCs w:val="20"/>
+        </w:rPr>
+        <w:t xml:space="preserve">Entregué sitios WordPress y HTML/CSS/JavaScript orientados a SEO, con schema markup, Google Analytics, Search Console y seguimiento de conversiones con Meta Pixel.</w:t>
+      </w:r>
+    </w:p>
+    <w:p>
+      <w:pPr>
+        <w:pStyle w:val="ListParagraph"/>
+        <w:numPr>
+          <w:ilvl w:val="0"/>
+          <w:numId w:val="2"/>
+        </w:numPr>
+        <w:spacing w:after="30"/>
+      </w:pPr>
+      <w:r>
+        <w:rPr>
+          <w:sz w:val="20"/>
+          <w:szCs w:val="20"/>
+        </w:rPr>
+        <w:t xml:space="preserve">Desarrollé plugins a la medida para automatizar leads e integrar el CRM, y administré servidores (cPanel, Linux), rendimiento y soporte en producción.</w:t>
       </w:r>
     </w:p>
     <w:p>
@@ -1122,7 +1075,7 @@
           <w:sz w:val="18"/>
           <w:szCs w:val="18"/>
         </w:rPr>
-        <w:t xml:space="preserve">IT support · Systems administration · WordPress</w:t>
+        <w:t xml:space="preserve">WordPress · JavaScript · Technical SEO · Google Analytics · Linux</w:t>
       </w:r>
     </w:p>
     <w:p>
@@ -1140,7 +1093,7 @@
           <w:sz w:val="21"/>
           <w:szCs w:val="21"/>
         </w:rPr>
-        <w:t xml:space="preserve">Especialista de TI e Integrador de Sistemas — Abatech</w:t>
+        <w:t xml:space="preserve">Especialista de TI y Desarrollador — SouthDesk</w:t>
       </w:r>
       <w:r>
         <w:rPr>
@@ -1148,72 +1101,55 @@
           <w:sz w:val="19"/>
           <w:szCs w:val="19"/>
         </w:rPr>
-        <w:t xml:space="preserve">	jul 2021 – abr 2023</w:t>
-      </w:r>
-    </w:p>
-    <w:p>
-      <w:pPr>
-        <w:keepNext/>
-        <w:spacing w:after="40"/>
-      </w:pPr>
-      <w:r>
-        <w:rPr>
-          <w:color w:val="52525B"/>
-          <w:sz w:val="18"/>
-          <w:szCs w:val="18"/>
-        </w:rPr>
-        <w:t xml:space="preserve">Medellín</w:t>
-      </w:r>
-    </w:p>
-    <w:p>
-      <w:pPr>
-        <w:pStyle w:val="ListParagraph"/>
-        <w:numPr>
-          <w:ilvl w:val="0"/>
-          <w:numId w:val="2"/>
-        </w:numPr>
-        <w:spacing w:after="30"/>
-      </w:pPr>
-      <w:r>
-        <w:rPr>
-          <w:sz w:val="20"/>
-          <w:szCs w:val="20"/>
-        </w:rPr>
-        <w:t xml:space="preserve">Administré infraestructura híbrida entre Azure y servidores locales; automaticé el mantenimiento con Python y Bash.</w:t>
-      </w:r>
-    </w:p>
-    <w:p>
-      <w:pPr>
-        <w:pStyle w:val="ListParagraph"/>
-        <w:numPr>
-          <w:ilvl w:val="0"/>
-          <w:numId w:val="2"/>
-        </w:numPr>
-        <w:spacing w:after="30"/>
-      </w:pPr>
-      <w:r>
-        <w:rPr>
-          <w:sz w:val="20"/>
-          <w:szCs w:val="20"/>
-        </w:rPr>
-        <w:t xml:space="preserve">Lideré la contenerización con Docker y la configuración de pipelines CI/CD, e implementé protocolos de ciberseguridad y análisis de riesgos.</w:t>
-      </w:r>
-    </w:p>
-    <w:p>
-      <w:pPr>
-        <w:pStyle w:val="ListParagraph"/>
-        <w:numPr>
-          <w:ilvl w:val="0"/>
-          <w:numId w:val="2"/>
-        </w:numPr>
-        <w:spacing w:after="30"/>
-      </w:pPr>
-      <w:r>
-        <w:rPr>
-          <w:sz w:val="20"/>
-          <w:szCs w:val="20"/>
-        </w:rPr>
-        <w:t xml:space="preserve">Construí landing pages y portales internos en WordPress con formularios integrados a APIs externas.</w:t>
+        <w:t xml:space="preserve">	may 2023 – oct 2023</w:t>
+      </w:r>
+    </w:p>
+    <w:p>
+      <w:pPr>
+        <w:keepNext/>
+        <w:spacing w:after="40"/>
+      </w:pPr>
+      <w:r>
+        <w:rPr>
+          <w:color w:val="52525B"/>
+          <w:sz w:val="18"/>
+          <w:szCs w:val="18"/>
+        </w:rPr>
+        <w:t xml:space="preserve">Remoto</w:t>
+      </w:r>
+    </w:p>
+    <w:p>
+      <w:pPr>
+        <w:pStyle w:val="ListParagraph"/>
+        <w:numPr>
+          <w:ilvl w:val="0"/>
+          <w:numId w:val="2"/>
+        </w:numPr>
+        <w:spacing w:after="30"/>
+      </w:pPr>
+      <w:r>
+        <w:rPr>
+          <w:sz w:val="20"/>
+          <w:szCs w:val="20"/>
+        </w:rPr>
+        <w:t xml:space="preserve">Di soporte a los sistemas de TI y la operación diaria: soporte a usuarios, administración de sistemas y resolución de problemas.</w:t>
+      </w:r>
+    </w:p>
+    <w:p>
+      <w:pPr>
+        <w:pStyle w:val="ListParagraph"/>
+        <w:numPr>
+          <w:ilvl w:val="0"/>
+          <w:numId w:val="2"/>
+        </w:numPr>
+        <w:spacing w:after="30"/>
+      </w:pPr>
+      <w:r>
+        <w:rPr>
+          <w:sz w:val="20"/>
+          <w:szCs w:val="20"/>
+        </w:rPr>
+        <w:t xml:space="preserve">Construí y mantuve el sitio web de la empresa, responsive y enfocado en conversión, junto con otras tareas de desarrollo.</w:t>
       </w:r>
     </w:p>
     <w:p>
@@ -1228,7 +1164,7 @@
           <w:sz w:val="18"/>
           <w:szCs w:val="18"/>
         </w:rPr>
-        <w:t xml:space="preserve">Azure · Docker · CI/CD · Python · Bash · Security</w:t>
+        <w:t xml:space="preserve">IT support · Systems administration · WordPress</w:t>
       </w:r>
     </w:p>
     <w:p>
@@ -1246,7 +1182,7 @@
           <w:sz w:val="21"/>
           <w:szCs w:val="21"/>
         </w:rPr>
-        <w:t xml:space="preserve">Analista de Software, Desarrollador y Colaborador UX — UNIFI BPO</w:t>
+        <w:t xml:space="preserve">Especialista de TI e Integrador de Sistemas — Abatech</w:t>
       </w:r>
       <w:r>
         <w:rPr>
@@ -1254,7 +1190,7 @@
           <w:sz w:val="19"/>
           <w:szCs w:val="19"/>
         </w:rPr>
-        <w:t xml:space="preserve">	abr 2019 – jul 2021</w:t>
+        <w:t xml:space="preserve">	jul 2022 – abr 2023</w:t>
       </w:r>
     </w:p>
     <w:p>
@@ -1285,24 +1221,24 @@
           <w:sz w:val="20"/>
           <w:szCs w:val="20"/>
         </w:rPr>
-        <w:t xml:space="preserve">Desarrollé aplicaciones web internas con React, FastAPI y MySQL que mejoraron la eficiencia de los procesos.</w:t>
-      </w:r>
-    </w:p>
-    <w:p>
-      <w:pPr>
-        <w:pStyle w:val="ListParagraph"/>
-        <w:numPr>
-          <w:ilvl w:val="0"/>
-          <w:numId w:val="2"/>
-        </w:numPr>
-        <w:spacing w:after="30"/>
-      </w:pPr>
-      <w:r>
-        <w:rPr>
-          <w:sz w:val="20"/>
-          <w:szCs w:val="20"/>
-        </w:rPr>
-        <w:t xml:space="preserve">Redacté requerimientos técnicos y documentación de APIs en Swagger, diseñé componentes de UI con el equipo de diseño en Figma y capacité a los usuarios en nuevas funciones.</w:t>
+        <w:t xml:space="preserve">Administré infraestructura híbrida entre Azure y servidores locales; automaticé el mantenimiento con Python y Bash.</w:t>
+      </w:r>
+    </w:p>
+    <w:p>
+      <w:pPr>
+        <w:pStyle w:val="ListParagraph"/>
+        <w:numPr>
+          <w:ilvl w:val="0"/>
+          <w:numId w:val="2"/>
+        </w:numPr>
+        <w:spacing w:after="30"/>
+      </w:pPr>
+      <w:r>
+        <w:rPr>
+          <w:sz w:val="20"/>
+          <w:szCs w:val="20"/>
+        </w:rPr>
+        <w:t xml:space="preserve">Lideré la contenerización con Docker y la configuración de pipelines CI/CD, e implementé protocolos de ciberseguridad y análisis de riesgos.</w:t>
       </w:r>
     </w:p>
     <w:p>
@@ -1317,7 +1253,7 @@
           <w:sz w:val="18"/>
           <w:szCs w:val="18"/>
         </w:rPr>
-        <w:t xml:space="preserve">React · FastAPI · MySQL · Swagger · Figma</w:t>
+        <w:t xml:space="preserve">Azure · Docker · CI/CD · Python · Bash · Security</w:t>
       </w:r>
     </w:p>
     <w:p>
@@ -1335,7 +1271,7 @@
           <w:sz w:val="21"/>
           <w:szCs w:val="21"/>
         </w:rPr>
-        <w:t xml:space="preserve">Desarrollador de Software y Consultor — Freelance</w:t>
+        <w:t xml:space="preserve">Analista de Software, Desarrollador y Colaborador UX — UNIFI BPO</w:t>
       </w:r>
       <w:r>
         <w:rPr>
@@ -1343,55 +1279,55 @@
           <w:sz w:val="19"/>
           <w:szCs w:val="19"/>
         </w:rPr>
-        <w:t xml:space="preserve">	feb 2017 – abr 2019</w:t>
-      </w:r>
-    </w:p>
-    <w:p>
-      <w:pPr>
-        <w:keepNext/>
-        <w:spacing w:after="40"/>
-      </w:pPr>
-      <w:r>
-        <w:rPr>
-          <w:color w:val="52525B"/>
-          <w:sz w:val="18"/>
-          <w:szCs w:val="18"/>
-        </w:rPr>
-        <w:t xml:space="preserve">Remoto</w:t>
-      </w:r>
-    </w:p>
-    <w:p>
-      <w:pPr>
-        <w:pStyle w:val="ListParagraph"/>
-        <w:numPr>
-          <w:ilvl w:val="0"/>
-          <w:numId w:val="2"/>
-        </w:numPr>
-        <w:spacing w:after="30"/>
-      </w:pPr>
-      <w:r>
-        <w:rPr>
-          <w:sz w:val="20"/>
-          <w:szCs w:val="20"/>
-        </w:rPr>
-        <w:t xml:space="preserve">Entregué soluciones SaaS con React, Node.js, Laravel y MongoDB, integrando Stripe, Twilio y Firebase — desde la arquitectura y el despliegue hasta manuales y capacitación.</w:t>
-      </w:r>
-    </w:p>
-    <w:p>
-      <w:pPr>
-        <w:pStyle w:val="ListParagraph"/>
-        <w:numPr>
-          <w:ilvl w:val="0"/>
-          <w:numId w:val="2"/>
-        </w:numPr>
-        <w:spacing w:after="30"/>
-      </w:pPr>
-      <w:r>
-        <w:rPr>
-          <w:sz w:val="20"/>
-          <w:szCs w:val="20"/>
-        </w:rPr>
-        <w:t xml:space="preserve">Construí soluciones WordPress para pymes: tiendas WooCommerce, sitios corporativos multilingües (WPML), sistemas de reservas y plugins a la medida de pagos y reservas.</w:t>
+        <w:t xml:space="preserve">	oct 2021 – jun 2022</w:t>
+      </w:r>
+    </w:p>
+    <w:p>
+      <w:pPr>
+        <w:keepNext/>
+        <w:spacing w:after="40"/>
+      </w:pPr>
+      <w:r>
+        <w:rPr>
+          <w:color w:val="52525B"/>
+          <w:sz w:val="18"/>
+          <w:szCs w:val="18"/>
+        </w:rPr>
+        <w:t xml:space="preserve">Medellín</w:t>
+      </w:r>
+    </w:p>
+    <w:p>
+      <w:pPr>
+        <w:pStyle w:val="ListParagraph"/>
+        <w:numPr>
+          <w:ilvl w:val="0"/>
+          <w:numId w:val="2"/>
+        </w:numPr>
+        <w:spacing w:after="30"/>
+      </w:pPr>
+      <w:r>
+        <w:rPr>
+          <w:sz w:val="20"/>
+          <w:szCs w:val="20"/>
+        </w:rPr>
+        <w:t xml:space="preserve">Desarrollé aplicaciones web internas con React, FastAPI y MySQL que mejoraron la eficiencia de los procesos.</w:t>
+      </w:r>
+    </w:p>
+    <w:p>
+      <w:pPr>
+        <w:pStyle w:val="ListParagraph"/>
+        <w:numPr>
+          <w:ilvl w:val="0"/>
+          <w:numId w:val="2"/>
+        </w:numPr>
+        <w:spacing w:after="30"/>
+      </w:pPr>
+      <w:r>
+        <w:rPr>
+          <w:sz w:val="20"/>
+          <w:szCs w:val="20"/>
+        </w:rPr>
+        <w:t xml:space="preserve">Redacté requerimientos técnicos y documentación de APIs en Swagger, diseñé componentes de UI con el equipo de diseño en Figma y capacité a los usuarios en nuevas funciones.</w:t>
       </w:r>
     </w:p>
     <w:p>
@@ -1406,7 +1342,7 @@
           <w:sz w:val="18"/>
           <w:szCs w:val="18"/>
         </w:rPr>
-        <w:t xml:space="preserve">React · Node.js · Laravel · MongoDB · Stripe · Twilio · WordPress</w:t>
+        <w:t xml:space="preserve">React · FastAPI · MySQL · Swagger · Figma</w:t>
       </w:r>
     </w:p>
     <w:p>
@@ -1424,7 +1360,7 @@
           <w:sz w:val="21"/>
           <w:szCs w:val="21"/>
         </w:rPr>
-        <w:t xml:space="preserve">Especialista de TI, Desarrollador Full-Stack y Líder de Equipo — Conquistadores Home, La Villa</w:t>
+        <w:t xml:space="preserve">Especialista de TI y Sistemas — CarNow</w:t>
       </w:r>
       <w:r>
         <w:rPr>
@@ -1432,55 +1368,38 @@
           <w:sz w:val="19"/>
           <w:szCs w:val="19"/>
         </w:rPr>
-        <w:t xml:space="preserve">	feb 2014 – ene 2017</w:t>
-      </w:r>
-    </w:p>
-    <w:p>
-      <w:pPr>
-        <w:keepNext/>
-        <w:spacing w:after="40"/>
-      </w:pPr>
-      <w:r>
-        <w:rPr>
-          <w:color w:val="52525B"/>
-          <w:sz w:val="18"/>
-          <w:szCs w:val="18"/>
-        </w:rPr>
-        <w:t xml:space="preserve">Medellín</w:t>
-      </w:r>
-    </w:p>
-    <w:p>
-      <w:pPr>
-        <w:pStyle w:val="ListParagraph"/>
-        <w:numPr>
-          <w:ilvl w:val="0"/>
-          <w:numId w:val="2"/>
-        </w:numPr>
-        <w:spacing w:after="30"/>
-      </w:pPr>
-      <w:r>
-        <w:rPr>
-          <w:sz w:val="20"/>
-          <w:szCs w:val="20"/>
-        </w:rPr>
-        <w:t xml:space="preserve">Desarrollé sistemas de reservas y gestión a la medida con Laravel, Bootstrap, JavaScript y MySQL, y el sitio corporativo con disponibilidad en vivo.</w:t>
-      </w:r>
-    </w:p>
-    <w:p>
-      <w:pPr>
-        <w:pStyle w:val="ListParagraph"/>
-        <w:numPr>
-          <w:ilvl w:val="0"/>
-          <w:numId w:val="2"/>
-        </w:numPr>
-        <w:spacing w:after="30"/>
-      </w:pPr>
-      <w:r>
-        <w:rPr>
-          <w:sz w:val="20"/>
-          <w:szCs w:val="20"/>
-        </w:rPr>
-        <w:t xml:space="preserve">Lideré un pequeño equipo técnico, definí estándares de código y administré una infraestructura de servidores segura con copias de respaldo periódicas.</w:t>
+        <w:t xml:space="preserve">	abr 2021 – sep 2021</w:t>
+      </w:r>
+    </w:p>
+    <w:p>
+      <w:pPr>
+        <w:keepNext/>
+        <w:spacing w:after="40"/>
+      </w:pPr>
+      <w:r>
+        <w:rPr>
+          <w:color w:val="52525B"/>
+          <w:sz w:val="18"/>
+          <w:szCs w:val="18"/>
+        </w:rPr>
+        <w:t xml:space="preserve">Medellín · empresa de EE. UU.</w:t>
+      </w:r>
+    </w:p>
+    <w:p>
+      <w:pPr>
+        <w:pStyle w:val="ListParagraph"/>
+        <w:numPr>
+          <w:ilvl w:val="0"/>
+          <w:numId w:val="2"/>
+        </w:numPr>
+        <w:spacing w:after="30"/>
+      </w:pPr>
+      <w:r>
+        <w:rPr>
+          <w:sz w:val="20"/>
+          <w:szCs w:val="20"/>
+        </w:rPr>
+        <w:t xml:space="preserve">Monté y soporté los sistemas de una nueva empresa estadounidense que iniciaba operaciones en Medellín: cuentas, equipos, software y soporte diario a usuarios.</w:t>
       </w:r>
     </w:p>
     <w:p>
@@ -1495,7 +1414,308 @@
           <w:sz w:val="18"/>
           <w:szCs w:val="18"/>
         </w:rPr>
-        <w:t xml:space="preserve">Laravel · MySQL · Bootstrap · JavaScript · WordPress</w:t>
+        <w:t xml:space="preserve"/>
+      </w:r>
+    </w:p>
+    <w:p>
+      <w:pPr>
+        <w:keepNext/>
+        <w:tabs>
+          <w:tab w:val="right" w:pos="10080"/>
+        </w:tabs>
+        <w:spacing w:before="140"/>
+      </w:pPr>
+      <w:r>
+        <w:rPr>
+          <w:b/>
+          <w:bCs/>
+          <w:sz w:val="21"/>
+          <w:szCs w:val="21"/>
+        </w:rPr>
+        <w:t xml:space="preserve">Gerente Nocturno — The Charlee Hotel</w:t>
+      </w:r>
+      <w:r>
+        <w:rPr>
+          <w:color w:val="52525B"/>
+          <w:sz w:val="19"/>
+          <w:szCs w:val="19"/>
+        </w:rPr>
+        <w:t xml:space="preserve">	sep 2020 – mar 2021</w:t>
+      </w:r>
+    </w:p>
+    <w:p>
+      <w:pPr>
+        <w:keepNext/>
+        <w:spacing w:after="40"/>
+      </w:pPr>
+      <w:r>
+        <w:rPr>
+          <w:color w:val="52525B"/>
+          <w:sz w:val="18"/>
+          <w:szCs w:val="18"/>
+        </w:rPr>
+        <w:t xml:space="preserve">El Poblado, Medellín</w:t>
+      </w:r>
+    </w:p>
+    <w:p>
+      <w:pPr>
+        <w:pStyle w:val="ListParagraph"/>
+        <w:numPr>
+          <w:ilvl w:val="0"/>
+          <w:numId w:val="2"/>
+        </w:numPr>
+        <w:spacing w:after="30"/>
+      </w:pPr>
+      <w:r>
+        <w:rPr>
+          <w:sz w:val="20"/>
+          <w:szCs w:val="20"/>
+        </w:rPr>
+        <w:t xml:space="preserve">Dirigí la operación nocturna de un hotel boutique en su reapertura tras las cuarentenas: recepción, auditoría nocturna, servicio al huésped, seguridad y los sistemas del hotel.</w:t>
+      </w:r>
+    </w:p>
+    <w:p>
+      <w:pPr>
+        <w:spacing w:after="40"/>
+      </w:pPr>
+      <w:r>
+        <w:rPr>
+          <w:i/>
+          <w:iCs/>
+          <w:color w:val="52525B"/>
+          <w:sz w:val="18"/>
+          <w:szCs w:val="18"/>
+        </w:rPr>
+        <w:t xml:space="preserve"/>
+      </w:r>
+    </w:p>
+    <w:p>
+      <w:pPr>
+        <w:keepNext/>
+        <w:tabs>
+          <w:tab w:val="right" w:pos="10080"/>
+        </w:tabs>
+        <w:spacing w:before="140"/>
+      </w:pPr>
+      <w:r>
+        <w:rPr>
+          <w:b/>
+          <w:bCs/>
+          <w:sz w:val="21"/>
+          <w:szCs w:val="21"/>
+        </w:rPr>
+        <w:t xml:space="preserve">Fundador y Gerente General — Negocio hotelero propio</w:t>
+      </w:r>
+      <w:r>
+        <w:rPr>
+          <w:color w:val="52525B"/>
+          <w:sz w:val="19"/>
+          <w:szCs w:val="19"/>
+        </w:rPr>
+        <w:t xml:space="preserve">	oct 2013 – mar 2020</w:t>
+      </w:r>
+    </w:p>
+    <w:p>
+      <w:pPr>
+        <w:keepNext/>
+        <w:spacing w:after="40"/>
+      </w:pPr>
+      <w:r>
+        <w:rPr>
+          <w:color w:val="52525B"/>
+          <w:sz w:val="18"/>
+          <w:szCs w:val="18"/>
+        </w:rPr>
+        <w:t xml:space="preserve">Medellín — Negocio propio — cerró cuando la pandemia paralizó el turismo</w:t>
+      </w:r>
+    </w:p>
+    <w:p>
+      <w:pPr>
+        <w:pStyle w:val="ListParagraph"/>
+        <w:numPr>
+          <w:ilvl w:val="0"/>
+          <w:numId w:val="2"/>
+        </w:numPr>
+        <w:spacing w:after="30"/>
+      </w:pPr>
+      <w:r>
+        <w:rPr>
+          <w:sz w:val="20"/>
+          <w:szCs w:val="20"/>
+        </w:rPr>
+        <w:t xml:space="preserve">Fundé y dirigí una operación de alquiler temporal y hotelería con siete propiedades: Apartahotel Santo Tomás, Hotel La Castellana, Nutibara Home, Calasanz Home, Hostería Villa Claudia, Tu Apartamento y Conquistadores Home.</w:t>
+      </w:r>
+    </w:p>
+    <w:p>
+      <w:pPr>
+        <w:pStyle w:val="ListParagraph"/>
+        <w:numPr>
+          <w:ilvl w:val="0"/>
+          <w:numId w:val="2"/>
+        </w:numPr>
+        <w:spacing w:after="30"/>
+      </w:pPr>
+      <w:r>
+        <w:rPr>
+          <w:sz w:val="20"/>
+          <w:szCs w:val="20"/>
+        </w:rPr>
+        <w:t xml:space="preserve">Responsable de todo el negocio: operación, personal, finanzas y administración, marca y marketing, y distribución en Airbnb y Booking.com.</w:t>
+      </w:r>
+    </w:p>
+    <w:p>
+      <w:pPr>
+        <w:pStyle w:val="ListParagraph"/>
+        <w:numPr>
+          <w:ilvl w:val="0"/>
+          <w:numId w:val="2"/>
+        </w:numPr>
+        <w:spacing w:after="30"/>
+      </w:pPr>
+      <w:r>
+        <w:rPr>
+          <w:sz w:val="20"/>
+          <w:szCs w:val="20"/>
+        </w:rPr>
+        <w:t xml:space="preserve">Desarrollé el sistema propio de reservas y gestión de propiedades (Laravel, Bootstrap, JavaScript, MySQL) y los sitios web con disponibilidad en vivo; administré servidores, respaldos y TI.</w:t>
+      </w:r>
+    </w:p>
+    <w:p>
+      <w:pPr>
+        <w:pStyle w:val="ListParagraph"/>
+        <w:numPr>
+          <w:ilvl w:val="0"/>
+          <w:numId w:val="2"/>
+        </w:numPr>
+        <w:spacing w:after="30"/>
+      </w:pPr>
+      <w:r>
+        <w:rPr>
+          <w:sz w:val="20"/>
+          <w:szCs w:val="20"/>
+        </w:rPr>
+        <w:t xml:space="preserve">En paralelo, entregué proyectos web para pymes: tiendas WooCommerce, sitios WordPress multilingües (WPML) e integraciones con Stripe, Twilio y Firebase.</w:t>
+      </w:r>
+    </w:p>
+    <w:p>
+      <w:pPr>
+        <w:spacing w:after="40"/>
+      </w:pPr>
+      <w:r>
+        <w:rPr>
+          <w:i/>
+          <w:iCs/>
+          <w:color w:val="52525B"/>
+          <w:sz w:val="18"/>
+          <w:szCs w:val="18"/>
+        </w:rPr>
+        <w:t xml:space="preserve">Laravel · MySQL · JavaScript · WordPress · Airbnb / Booking.com · Operations · Marketing</w:t>
+      </w:r>
+    </w:p>
+    <w:p>
+      <w:pPr>
+        <w:keepNext/>
+        <w:tabs>
+          <w:tab w:val="right" w:pos="10080"/>
+        </w:tabs>
+        <w:spacing w:before="140"/>
+      </w:pPr>
+      <w:r>
+        <w:rPr>
+          <w:b/>
+          <w:bCs/>
+          <w:sz w:val="21"/>
+          <w:szCs w:val="21"/>
+        </w:rPr>
+        <w:t xml:space="preserve">Desarrollador de Software y TI — .NET — Aerolínea de Antioquia (ADA)</w:t>
+      </w:r>
+      <w:r>
+        <w:rPr>
+          <w:color w:val="52525B"/>
+          <w:sz w:val="19"/>
+          <w:szCs w:val="19"/>
+        </w:rPr>
+        <w:t xml:space="preserve">	feb 2011 – jun 2013</w:t>
+      </w:r>
+    </w:p>
+    <w:p>
+      <w:pPr>
+        <w:keepNext/>
+        <w:spacing w:after="40"/>
+      </w:pPr>
+      <w:r>
+        <w:rPr>
+          <w:color w:val="52525B"/>
+          <w:sz w:val="18"/>
+          <w:szCs w:val="18"/>
+        </w:rPr>
+        <w:t xml:space="preserve">Medellín</w:t>
+      </w:r>
+    </w:p>
+    <w:p>
+      <w:pPr>
+        <w:pStyle w:val="ListParagraph"/>
+        <w:numPr>
+          <w:ilvl w:val="0"/>
+          <w:numId w:val="2"/>
+        </w:numPr>
+        <w:spacing w:after="30"/>
+      </w:pPr>
+      <w:r>
+        <w:rPr>
+          <w:sz w:val="20"/>
+          <w:szCs w:val="20"/>
+        </w:rPr>
+        <w:t xml:space="preserve">Desarrollé y mantuve el sistema de venta de tiquetes y trayectos de la aerolínea en .NET (C#) y SQL Server, y corregí inconsistencias de datos en el backend de ventas.</w:t>
+      </w:r>
+    </w:p>
+    <w:p>
+      <w:pPr>
+        <w:pStyle w:val="ListParagraph"/>
+        <w:numPr>
+          <w:ilvl w:val="0"/>
+          <w:numId w:val="2"/>
+        </w:numPr>
+        <w:spacing w:after="30"/>
+      </w:pPr>
+      <w:r>
+        <w:rPr>
+          <w:sz w:val="20"/>
+          <w:szCs w:val="20"/>
+        </w:rPr>
+        <w:t xml:space="preserve">Integré las ventas con el sistema contable DMS y construí herramientas internas de reportes operativos.</w:t>
+      </w:r>
+    </w:p>
+    <w:p>
+      <w:pPr>
+        <w:pStyle w:val="ListParagraph"/>
+        <w:numPr>
+          <w:ilvl w:val="0"/>
+          <w:numId w:val="2"/>
+        </w:numPr>
+        <w:spacing w:after="30"/>
+      </w:pPr>
+      <w:r>
+        <w:rPr>
+          <w:sz w:val="20"/>
+          <w:szCs w:val="20"/>
+        </w:rPr>
+        <w:t xml:space="preserve">Di soporte de TI: mesa de ayuda a usuarios, instalación de equipos y solución de fallas.</w:t>
+      </w:r>
+    </w:p>
+    <w:p>
+      <w:pPr>
+        <w:spacing w:after="40"/>
+      </w:pPr>
+      <w:r>
+        <w:rPr>
+          <w:i/>
+          <w:iCs/>
+          <w:color w:val="52525B"/>
+          <w:sz w:val="18"/>
+          <w:szCs w:val="18"/>
+        </w:rPr>
+        <w:t xml:space="preserve">C# · .NET · SQL Server · DMS integration · IT support</w:t>
       </w:r>
     </w:p>
     <w:p>
@@ -1515,7 +1735,7 @@
           <w:sz w:val="20"/>
           <w:szCs w:val="20"/>
         </w:rPr>
-        <w:t xml:space="preserve">EXPERIENCIA ANTERIOR (2008 – 2013)</w:t>
+        <w:t xml:space="preserve">EXPERIENCIA ANTERIOR — HOTELERÍA Y TI (2005 – 2013)</w:t>
       </w:r>
     </w:p>
     <w:p>
@@ -1533,7 +1753,7 @@
           <w:sz w:val="21"/>
           <w:szCs w:val="21"/>
         </w:rPr>
-        <w:t xml:space="preserve">Analista y Desarrollador de Software, TI — Aerolíneas de Antioquia (ADA)</w:t>
+        <w:t xml:space="preserve">Soporte de Sistemas — Agenciauto</w:t>
       </w:r>
       <w:r>
         <w:rPr>
@@ -1541,19 +1761,19 @@
           <w:sz w:val="19"/>
           <w:szCs w:val="19"/>
         </w:rPr>
-        <w:t xml:space="preserve">	feb 2011 – dic 2013</w:t>
-      </w:r>
-    </w:p>
-    <w:p>
-      <w:pPr>
-        <w:spacing w:after="30"/>
-      </w:pPr>
-      <w:r>
-        <w:rPr>
-          <w:sz w:val="20"/>
-          <w:szCs w:val="20"/>
-        </w:rPr>
-        <w:t xml:space="preserve">Herramientas internas de programación de vuelos, gestión de pasajeros y reportes operativos (PHP, C#, SQL Server).</w:t>
+        <w:t xml:space="preserve">	jul 2013 – sep 2013</w:t>
+      </w:r>
+    </w:p>
+    <w:p>
+      <w:pPr>
+        <w:spacing w:after="30"/>
+      </w:pPr>
+      <w:r>
+        <w:rPr>
+          <w:sz w:val="20"/>
+          <w:szCs w:val="20"/>
+        </w:rPr>
+        <w:t xml:space="preserve">Vinculación corta en soporte de TI y sistemas.</w:t>
       </w:r>
     </w:p>
     <w:p>
@@ -1571,7 +1791,7 @@
           <w:sz w:val="21"/>
           <w:szCs w:val="21"/>
         </w:rPr>
-        <w:t xml:space="preserve">Auditor Nocturno — Gestor de Sistemas — The Charlee Hotels</w:t>
+        <w:t xml:space="preserve">Auditor Nocturno — Comfort Suites Laureles · San Joaquín · Sky Plus Best Western · Poblado Plaza</w:t>
       </w:r>
       <w:r>
         <w:rPr>
@@ -1579,19 +1799,19 @@
           <w:sz w:val="19"/>
           <w:szCs w:val="19"/>
         </w:rPr>
-        <w:t xml:space="preserve">	ene 2010 – ene 2011</w:t>
-      </w:r>
-    </w:p>
-    <w:p>
-      <w:pPr>
-        <w:spacing w:after="30"/>
-      </w:pPr>
-      <w:r>
-        <w:rPr>
-          <w:sz w:val="20"/>
-          <w:szCs w:val="20"/>
-        </w:rPr>
-        <w:t xml:space="preserve">Sistemas financieros y operativos, automatización de auditorías e integridad de datos.</w:t>
+        <w:t xml:space="preserve">	2010 – 2011</w:t>
+      </w:r>
+    </w:p>
+    <w:p>
+      <w:pPr>
+        <w:spacing w:after="30"/>
+      </w:pPr>
+      <w:r>
+        <w:rPr>
+          <w:sz w:val="20"/>
+          <w:szCs w:val="20"/>
+        </w:rPr>
+        <w:t xml:space="preserve">Auditoría nocturna, recepción y sistemas hoteleros en varios hoteles de Medellín.</w:t>
       </w:r>
     </w:p>
     <w:p>
@@ -1609,7 +1829,7 @@
           <w:sz w:val="21"/>
           <w:szCs w:val="21"/>
         </w:rPr>
-        <w:t xml:space="preserve">Especialista de TI y Desarrollador Front-End — Two Cousins Trucking</w:t>
+        <w:t xml:space="preserve">Recepcionista → Auditor Nocturno → Jefe de Recepción — Affinity Aparta Hotel / EE Hoteles</w:t>
       </w:r>
       <w:r>
         <w:rPr>
@@ -1617,57 +1837,19 @@
           <w:sz w:val="19"/>
           <w:szCs w:val="19"/>
         </w:rPr>
-        <w:t xml:space="preserve">	feb 2008 – ene 2010</w:t>
-      </w:r>
-    </w:p>
-    <w:p>
-      <w:pPr>
-        <w:spacing w:after="30"/>
-      </w:pPr>
-      <w:r>
-        <w:rPr>
-          <w:sz w:val="20"/>
-          <w:szCs w:val="20"/>
-        </w:rPr>
-        <w:t xml:space="preserve">Aplicaciones web front-end en JavaScript, infraestructura de TI y auditorías de seguridad.</w:t>
-      </w:r>
-    </w:p>
-    <w:p>
-      <w:pPr>
-        <w:keepNext/>
-        <w:tabs>
-          <w:tab w:val="right" w:pos="10080"/>
-        </w:tabs>
-        <w:spacing w:before="140"/>
-      </w:pPr>
-      <w:r>
-        <w:rPr>
-          <w:b/>
-          <w:bCs/>
-          <w:sz w:val="21"/>
-          <w:szCs w:val="21"/>
-        </w:rPr>
-        <w:t xml:space="preserve">Auditor Nocturno — Sistemas — Novelty Suites S.A.</w:t>
-      </w:r>
-      <w:r>
-        <w:rPr>
-          <w:color w:val="52525B"/>
-          <w:sz w:val="19"/>
-          <w:szCs w:val="19"/>
-        </w:rPr>
-        <w:t xml:space="preserve">	6 años</w:t>
-      </w:r>
-    </w:p>
-    <w:p>
-      <w:pPr>
-        <w:spacing w:after="30"/>
-      </w:pPr>
-      <w:r>
-        <w:rPr>
-          <w:sz w:val="20"/>
-          <w:szCs w:val="20"/>
-        </w:rPr>
-        <w:t xml:space="preserve">Operación de auditoría nocturna, sistemas financieros y exactitud de reportes.</w:t>
+        <w:t xml:space="preserve">	2005 – 2010</w:t>
+      </w:r>
+    </w:p>
+    <w:p>
+      <w:pPr>
+        <w:spacing w:after="30"/>
+      </w:pPr>
+      <w:r>
+        <w:rPr>
+          <w:sz w:val="20"/>
+          <w:szCs w:val="20"/>
+        </w:rPr>
+        <w:t xml:space="preserve">Seis años en las sedes del grupo (Affinity, Alcázar de Oviedo, Rodeo, Novelty Suites y otras): recepción, auditoría nocturna, jefatura de recepción y sistemas hoteleros.</w:t>
       </w:r>
     </w:p>
     <w:p>

</xml_diff>

<commit_message>
fix(resume): describe David as developer and technical lead, not engineer
"Ingeniero" is a protected professional title in Colombia; use Senior
Full-Stack Developer / Technical Lead across the CV, the portfolio copy and
the LinkedIn kit.

Co-Authored-By: Claude Opus 5.5 <noreply@anthropic.com>
Claude-Session: https://claude.ai/code/session_01LBMvfUQ6YDGZ1wc9D6Yjrn
</commit_message>
<xml_diff>
--- a/public/cv/David-Gomez-Hoja-de-Vida-ES.docx
+++ b/public/cv/David-Gomez-Hoja-de-Vida-ES.docx
@@ -25,7 +25,7 @@
           <w:sz w:val="23"/>
           <w:szCs w:val="23"/>
         </w:rPr>
-        <w:t xml:space="preserve">Ingeniero Full-Stack Senior · Cloud, Plataformas y Automatización IA</w:t>
+        <w:t xml:space="preserve">Desarrollador Full-Stack Senior y Líder Técnico · Cloud, Plataformas y Automatización IA</w:t>
       </w:r>
     </w:p>
     <w:p>
@@ -37,7 +37,7 @@
         </w:rPr>
         <w:t xml:space="preserve">Medellín, Colombia · Disponible remoto e híbrido  |  +57 317 853 0602  |  </w:t>
       </w:r>
-      <w:hyperlink w:history="1" r:id="rIdzpv1oo20jaht9qdum05to">
+      <w:hyperlink w:history="1" r:id="rIdp-0dwta7tlvcgeu-hhbru">
         <w:r>
           <w:rPr>
             <w:rStyle w:val="Hyperlink"/>
@@ -49,7 +49,7 @@
       </w:hyperlink>
     </w:p>
     <w:p>
-      <w:hyperlink w:history="1" r:id="rIdpddacir4m_4e4g-tzzkiv">
+      <w:hyperlink w:history="1" r:id="rIddwbowrpiu6vspf2vzyv0e">
         <w:r>
           <w:rPr>
             <w:rStyle w:val="Hyperlink"/>
@@ -67,7 +67,7 @@
         </w:rPr>
         <w:t xml:space="preserve">  |  </w:t>
       </w:r>
-      <w:hyperlink w:history="1" r:id="rIdqhsrfw_408ranwnluguel">
+      <w:hyperlink w:history="1" r:id="rIdbohgsgelhkjaomfkrhyyq">
         <w:r>
           <w:rPr>
             <w:rStyle w:val="Hyperlink"/>
@@ -85,7 +85,7 @@
         </w:rPr>
         <w:t xml:space="preserve">  |  </w:t>
       </w:r>
-      <w:hyperlink w:history="1" r:id="rId1qc4dmjqpive6x868lxfn">
+      <w:hyperlink w:history="1" r:id="rIdy4q5yetm7zke2_ryko0lk">
         <w:r>
           <w:rPr>
             <w:rStyle w:val="Hyperlink"/>
@@ -125,7 +125,7 @@
           <w:sz w:val="20"/>
           <w:szCs w:val="20"/>
         </w:rPr>
-        <w:t xml:space="preserve">Ingeniero full-stack senior con más de 15 años en software y TI — y más de 20 años de trayectoria que incluye fundar y dirigir mi propio negocio hotelero. Llevo productos desde un repositorio vacío hasta producción — arquitectura, backend, frontend, móvil, pagos e infraestructura — y construyo la automatización con IA a su alrededor. Trabajo con PHP/Laravel, React/TypeScript, Node.js, Python, PostgreSQL, AWS, Azure, Cloudflare, Docker y Terraform. Haber dirigido un negocio completo me hace construir pensando en la operación, el cliente y los márgenes. Bilingüe inglés/español, con experiencia remota en equipos internacionales.</w:t>
+        <w:t xml:space="preserve">Desarrollador full-stack senior y líder técnico con más de 15 años en software y TI — y más de 20 años de trayectoria que incluye fundar y dirigir mi propio negocio hotelero. Llevo productos desde un repositorio vacío hasta producción — arquitectura, backend, frontend, móvil, pagos e infraestructura — y construyo la automatización con IA a su alrededor. Trabajo con PHP/Laravel, React/TypeScript, Node.js, Python, PostgreSQL, AWS, Azure, Cloudflare, Docker y Terraform. Haber dirigido un negocio completo me hace construir pensando en la operación, el cliente y los márgenes. Bilingüe inglés/español, con experiencia remota en equipos internacionales.</w:t>
       </w:r>
     </w:p>
     <w:p>
@@ -419,7 +419,7 @@
           <w:sz w:val="21"/>
           <w:szCs w:val="21"/>
         </w:rPr>
-        <w:t xml:space="preserve">Fundador e Ingeniero Líder — GWork Systems</w:t>
+        <w:t xml:space="preserve">Fundador y Líder Técnico — GWork Systems</w:t>
       </w:r>
       <w:r>
         <w:rPr>

</xml_diff>

<commit_message>
feat(resume): add Solvo Global, 2022–23 contracts and New York years
- Solvo Global (assigned to CarNow) replaces the standalone CarNow entry
- Freelance & contract projects: Adage LATAM, All Bookings, Admin Ops
- Two Cousins Trucking (New York, 2003–2005) in earlier experience
- Hotel years merged into one entry; PDFs stay at 3 pages
- LinkedIn kit: entry-by-entry edit list against the current profile

Co-Authored-By: Claude Opus 5.5 <noreply@anthropic.com>
Claude-Session: https://claude.ai/code/session_01LBMvfUQ6YDGZ1wc9D6Yjrn
</commit_message>
<xml_diff>
--- a/public/cv/David-Gomez-Hoja-de-Vida-ES.docx
+++ b/public/cv/David-Gomez-Hoja-de-Vida-ES.docx
@@ -37,7 +37,7 @@
         </w:rPr>
         <w:t xml:space="preserve">Medellín, Colombia · Disponible remoto e híbrido  |  +57 317 853 0602  |  </w:t>
       </w:r>
-      <w:hyperlink w:history="1" r:id="rIdp-0dwta7tlvcgeu-hhbru">
+      <w:hyperlink w:history="1" r:id="rIdwdynh2xgknurmu6xaunbk">
         <w:r>
           <w:rPr>
             <w:rStyle w:val="Hyperlink"/>
@@ -49,7 +49,7 @@
       </w:hyperlink>
     </w:p>
     <w:p>
-      <w:hyperlink w:history="1" r:id="rIddwbowrpiu6vspf2vzyv0e">
+      <w:hyperlink w:history="1" r:id="rIdjpfk9q5qzchqzkfc_czdv">
         <w:r>
           <w:rPr>
             <w:rStyle w:val="Hyperlink"/>
@@ -67,7 +67,7 @@
         </w:rPr>
         <w:t xml:space="preserve">  |  </w:t>
       </w:r>
-      <w:hyperlink w:history="1" r:id="rIdbohgsgelhkjaomfkrhyyq">
+      <w:hyperlink w:history="1" r:id="rIdnmqvxezjtc5wr3ymddtzz">
         <w:r>
           <w:rPr>
             <w:rStyle w:val="Hyperlink"/>
@@ -85,7 +85,7 @@
         </w:rPr>
         <w:t xml:space="preserve">  |  </w:t>
       </w:r>
-      <w:hyperlink w:history="1" r:id="rIdy4q5yetm7zke2_ryko0lk">
+      <w:hyperlink w:history="1" r:id="rIdqgorf5doowicsxuu07lqz">
         <w:r>
           <w:rPr>
             <w:rStyle w:val="Hyperlink"/>
@@ -125,7 +125,7 @@
           <w:sz w:val="20"/>
           <w:szCs w:val="20"/>
         </w:rPr>
-        <w:t xml:space="preserve">Desarrollador full-stack senior y líder técnico con más de 15 años en software y TI — y más de 20 años de trayectoria que incluye fundar y dirigir mi propio negocio hotelero. Llevo productos desde un repositorio vacío hasta producción — arquitectura, backend, frontend, móvil, pagos e infraestructura — y construyo la automatización con IA a su alrededor. Trabajo con PHP/Laravel, React/TypeScript, Node.js, Python, PostgreSQL, AWS, Azure, Cloudflare, Docker y Terraform. Haber dirigido un negocio completo me hace construir pensando en la operación, el cliente y los márgenes. Bilingüe inglés/español, con experiencia remota en equipos internacionales.</w:t>
+        <w:t xml:space="preserve">Desarrollador full-stack senior y líder técnico con más de 15 años en software y TI — y más de 20 años de trayectoria que incluye fundar y dirigir mi propio negocio hotelero. Llevo productos desde un repositorio vacío hasta producción — arquitectura, backend, frontend, móvil, pagos e infraestructura — y construyo la automatización con IA a su alrededor. Trabajo con PHP/Laravel, React/TypeScript, Node.js, Python, PostgreSQL, AWS, Azure, Cloudflare, Docker y Terraform. Haber dirigido un negocio me hace construir pensando en la operación y el cliente. Bilingüe inglés/español.</w:t>
       </w:r>
     </w:p>
     <w:p>
@@ -685,7 +685,7 @@
           <w:sz w:val="18"/>
           <w:szCs w:val="18"/>
         </w:rPr>
-        <w:t xml:space="preserve">WordPress · PHP · JavaScript · Performance</w:t>
+        <w:t xml:space="preserve"/>
       </w:r>
     </w:p>
     <w:p>
@@ -1075,7 +1075,7 @@
           <w:sz w:val="18"/>
           <w:szCs w:val="18"/>
         </w:rPr>
-        <w:t xml:space="preserve">WordPress · JavaScript · Technical SEO · Google Analytics · Linux</w:t>
+        <w:t xml:space="preserve"/>
       </w:r>
     </w:p>
     <w:p>
@@ -1164,7 +1164,7 @@
           <w:sz w:val="18"/>
           <w:szCs w:val="18"/>
         </w:rPr>
-        <w:t xml:space="preserve">IT support · Systems administration · WordPress</w:t>
+        <w:t xml:space="preserve"/>
       </w:r>
     </w:p>
     <w:p>
@@ -1271,7 +1271,7 @@
           <w:sz w:val="21"/>
           <w:szCs w:val="21"/>
         </w:rPr>
-        <w:t xml:space="preserve">Analista de Software, Desarrollador y Colaborador UX — UNIFI BPO</w:t>
+        <w:t xml:space="preserve">Desarrollador Full-Stack y DBA — Proyectos freelance y por contrato</w:t>
       </w:r>
       <w:r>
         <w:rPr>
@@ -1279,55 +1279,72 @@
           <w:sz w:val="19"/>
           <w:szCs w:val="19"/>
         </w:rPr>
-        <w:t xml:space="preserve">	oct 2021 – jun 2022</w:t>
-      </w:r>
-    </w:p>
-    <w:p>
-      <w:pPr>
-        <w:keepNext/>
-        <w:spacing w:after="40"/>
-      </w:pPr>
-      <w:r>
-        <w:rPr>
-          <w:color w:val="52525B"/>
-          <w:sz w:val="18"/>
-          <w:szCs w:val="18"/>
-        </w:rPr>
-        <w:t xml:space="preserve">Medellín</w:t>
-      </w:r>
-    </w:p>
-    <w:p>
-      <w:pPr>
-        <w:pStyle w:val="ListParagraph"/>
-        <w:numPr>
-          <w:ilvl w:val="0"/>
-          <w:numId w:val="2"/>
-        </w:numPr>
-        <w:spacing w:after="30"/>
-      </w:pPr>
-      <w:r>
-        <w:rPr>
-          <w:sz w:val="20"/>
-          <w:szCs w:val="20"/>
-        </w:rPr>
-        <w:t xml:space="preserve">Desarrollé aplicaciones web internas con React, FastAPI y MySQL que mejoraron la eficiencia de los procesos.</w:t>
-      </w:r>
-    </w:p>
-    <w:p>
-      <w:pPr>
-        <w:pStyle w:val="ListParagraph"/>
-        <w:numPr>
-          <w:ilvl w:val="0"/>
-          <w:numId w:val="2"/>
-        </w:numPr>
-        <w:spacing w:after="30"/>
-      </w:pPr>
-      <w:r>
-        <w:rPr>
-          <w:sz w:val="20"/>
-          <w:szCs w:val="20"/>
-        </w:rPr>
-        <w:t xml:space="preserve">Redacté requerimientos técnicos y documentación de APIs en Swagger, diseñé componentes de UI con el equipo de diseño en Figma y capacité a los usuarios en nuevas funciones.</w:t>
+        <w:t xml:space="preserve">	ene 2022 – feb 2023</w:t>
+      </w:r>
+    </w:p>
+    <w:p>
+      <w:pPr>
+        <w:keepNext/>
+        <w:spacing w:after="40"/>
+      </w:pPr>
+      <w:r>
+        <w:rPr>
+          <w:color w:val="52525B"/>
+          <w:sz w:val="18"/>
+          <w:szCs w:val="18"/>
+        </w:rPr>
+        <w:t xml:space="preserve">Remoto · en paralelo</w:t>
+      </w:r>
+    </w:p>
+    <w:p>
+      <w:pPr>
+        <w:pStyle w:val="ListParagraph"/>
+        <w:numPr>
+          <w:ilvl w:val="0"/>
+          <w:numId w:val="2"/>
+        </w:numPr>
+        <w:spacing w:after="30"/>
+      </w:pPr>
+      <w:r>
+        <w:rPr>
+          <w:sz w:val="20"/>
+          <w:szCs w:val="20"/>
+        </w:rPr>
+        <w:t xml:space="preserve">Adage LATAM — desarrollo en SQL Server y administración de bases de datos.</w:t>
+      </w:r>
+    </w:p>
+    <w:p>
+      <w:pPr>
+        <w:pStyle w:val="ListParagraph"/>
+        <w:numPr>
+          <w:ilvl w:val="0"/>
+          <w:numId w:val="2"/>
+        </w:numPr>
+        <w:spacing w:after="30"/>
+      </w:pPr>
+      <w:r>
+        <w:rPr>
+          <w:sz w:val="20"/>
+          <w:szCs w:val="20"/>
+        </w:rPr>
+        <w:t xml:space="preserve">All Bookings — desarrollo full-stack del marketplace de alojamiento original (luego reconstruido como All Bookings 2.0).</w:t>
+      </w:r>
+    </w:p>
+    <w:p>
+      <w:pPr>
+        <w:pStyle w:val="ListParagraph"/>
+        <w:numPr>
+          <w:ilvl w:val="0"/>
+          <w:numId w:val="2"/>
+        </w:numPr>
+        <w:spacing w:after="30"/>
+      </w:pPr>
+      <w:r>
+        <w:rPr>
+          <w:sz w:val="20"/>
+          <w:szCs w:val="20"/>
+        </w:rPr>
+        <w:t xml:space="preserve">Admin Ops — desarrollo front-end y WordPress como líder del equipo web (adminops.com).</w:t>
       </w:r>
     </w:p>
     <w:p>
@@ -1342,7 +1359,7 @@
           <w:sz w:val="18"/>
           <w:szCs w:val="18"/>
         </w:rPr>
-        <w:t xml:space="preserve">React · FastAPI · MySQL · Swagger · Figma</w:t>
+        <w:t xml:space="preserve"/>
       </w:r>
     </w:p>
     <w:p>
@@ -1360,7 +1377,7 @@
           <w:sz w:val="21"/>
           <w:szCs w:val="21"/>
         </w:rPr>
-        <w:t xml:space="preserve">Especialista de TI y Sistemas — CarNow</w:t>
+        <w:t xml:space="preserve">Analista de Software, Desarrollador y Colaborador UX — UNIFI BPO</w:t>
       </w:r>
       <w:r>
         <w:rPr>
@@ -1368,38 +1385,55 @@
           <w:sz w:val="19"/>
           <w:szCs w:val="19"/>
         </w:rPr>
-        <w:t xml:space="preserve">	abr 2021 – sep 2021</w:t>
-      </w:r>
-    </w:p>
-    <w:p>
-      <w:pPr>
-        <w:keepNext/>
-        <w:spacing w:after="40"/>
-      </w:pPr>
-      <w:r>
-        <w:rPr>
-          <w:color w:val="52525B"/>
-          <w:sz w:val="18"/>
-          <w:szCs w:val="18"/>
-        </w:rPr>
-        <w:t xml:space="preserve">Medellín · empresa de EE. UU.</w:t>
-      </w:r>
-    </w:p>
-    <w:p>
-      <w:pPr>
-        <w:pStyle w:val="ListParagraph"/>
-        <w:numPr>
-          <w:ilvl w:val="0"/>
-          <w:numId w:val="2"/>
-        </w:numPr>
-        <w:spacing w:after="30"/>
-      </w:pPr>
-      <w:r>
-        <w:rPr>
-          <w:sz w:val="20"/>
-          <w:szCs w:val="20"/>
-        </w:rPr>
-        <w:t xml:space="preserve">Monté y soporté los sistemas de una nueva empresa estadounidense que iniciaba operaciones en Medellín: cuentas, equipos, software y soporte diario a usuarios.</w:t>
+        <w:t xml:space="preserve">	oct 2021 – jun 2022</w:t>
+      </w:r>
+    </w:p>
+    <w:p>
+      <w:pPr>
+        <w:keepNext/>
+        <w:spacing w:after="40"/>
+      </w:pPr>
+      <w:r>
+        <w:rPr>
+          <w:color w:val="52525B"/>
+          <w:sz w:val="18"/>
+          <w:szCs w:val="18"/>
+        </w:rPr>
+        <w:t xml:space="preserve">Medellín</w:t>
+      </w:r>
+    </w:p>
+    <w:p>
+      <w:pPr>
+        <w:pStyle w:val="ListParagraph"/>
+        <w:numPr>
+          <w:ilvl w:val="0"/>
+          <w:numId w:val="2"/>
+        </w:numPr>
+        <w:spacing w:after="30"/>
+      </w:pPr>
+      <w:r>
+        <w:rPr>
+          <w:sz w:val="20"/>
+          <w:szCs w:val="20"/>
+        </w:rPr>
+        <w:t xml:space="preserve">Desarrollé aplicaciones web internas con React, FastAPI y MySQL que mejoraron la eficiencia de los procesos.</w:t>
+      </w:r>
+    </w:p>
+    <w:p>
+      <w:pPr>
+        <w:pStyle w:val="ListParagraph"/>
+        <w:numPr>
+          <w:ilvl w:val="0"/>
+          <w:numId w:val="2"/>
+        </w:numPr>
+        <w:spacing w:after="30"/>
+      </w:pPr>
+      <w:r>
+        <w:rPr>
+          <w:sz w:val="20"/>
+          <w:szCs w:val="20"/>
+        </w:rPr>
+        <w:t xml:space="preserve">Redacté requerimientos técnicos y documentación de APIs en Swagger, diseñé componentes de UI con el equipo de diseño en Figma y capacité a los usuarios en nuevas funciones.</w:t>
       </w:r>
     </w:p>
     <w:p>
@@ -1414,7 +1448,7 @@
           <w:sz w:val="18"/>
           <w:szCs w:val="18"/>
         </w:rPr>
-        <w:t xml:space="preserve"/>
+        <w:t xml:space="preserve">React · FastAPI · MySQL · Swagger · Figma</w:t>
       </w:r>
     </w:p>
     <w:p>
@@ -1432,7 +1466,7 @@
           <w:sz w:val="21"/>
           <w:szCs w:val="21"/>
         </w:rPr>
-        <w:t xml:space="preserve">Gerente Nocturno — The Charlee Hotel</w:t>
+        <w:t xml:space="preserve">Analista de Sistemas — Solvo Global</w:t>
       </w:r>
       <w:r>
         <w:rPr>
@@ -1440,38 +1474,38 @@
           <w:sz w:val="19"/>
           <w:szCs w:val="19"/>
         </w:rPr>
-        <w:t xml:space="preserve">	sep 2020 – mar 2021</w:t>
-      </w:r>
-    </w:p>
-    <w:p>
-      <w:pPr>
-        <w:keepNext/>
-        <w:spacing w:after="40"/>
-      </w:pPr>
-      <w:r>
-        <w:rPr>
-          <w:color w:val="52525B"/>
-          <w:sz w:val="18"/>
-          <w:szCs w:val="18"/>
-        </w:rPr>
-        <w:t xml:space="preserve">El Poblado, Medellín</w:t>
-      </w:r>
-    </w:p>
-    <w:p>
-      <w:pPr>
-        <w:pStyle w:val="ListParagraph"/>
-        <w:numPr>
-          <w:ilvl w:val="0"/>
-          <w:numId w:val="2"/>
-        </w:numPr>
-        <w:spacing w:after="30"/>
-      </w:pPr>
-      <w:r>
-        <w:rPr>
-          <w:sz w:val="20"/>
-          <w:szCs w:val="20"/>
-        </w:rPr>
-        <w:t xml:space="preserve">Dirigí la operación nocturna de un hotel boutique en su reapertura tras las cuarentenas: recepción, auditoría nocturna, servicio al huésped, seguridad y los sistemas del hotel.</w:t>
+        <w:t xml:space="preserve">	abr 2021 – sep 2021</w:t>
+      </w:r>
+    </w:p>
+    <w:p>
+      <w:pPr>
+        <w:keepNext/>
+        <w:spacing w:after="40"/>
+      </w:pPr>
+      <w:r>
+        <w:rPr>
+          <w:color w:val="52525B"/>
+          <w:sz w:val="18"/>
+          <w:szCs w:val="18"/>
+        </w:rPr>
+        <w:t xml:space="preserve">Medellín — Asignado a CarNow, empresa de EE. UU.</w:t>
+      </w:r>
+    </w:p>
+    <w:p>
+      <w:pPr>
+        <w:pStyle w:val="ListParagraph"/>
+        <w:numPr>
+          <w:ilvl w:val="0"/>
+          <w:numId w:val="2"/>
+        </w:numPr>
+        <w:spacing w:after="30"/>
+      </w:pPr>
+      <w:r>
+        <w:rPr>
+          <w:sz w:val="20"/>
+          <w:szCs w:val="20"/>
+        </w:rPr>
+        <w:t xml:space="preserve">Monté y soporté los sistemas de un cliente estadounidense que iniciaba operaciones en Medellín: cuentas, equipos, software y soporte bilingüe diario a usuarios.</w:t>
       </w:r>
     </w:p>
     <w:p>
@@ -1504,7 +1538,7 @@
           <w:sz w:val="21"/>
           <w:szCs w:val="21"/>
         </w:rPr>
-        <w:t xml:space="preserve">Fundador y Gerente General — Negocio hotelero propio</w:t>
+        <w:t xml:space="preserve">Gerente Nocturno — The Charlee Hotel</w:t>
       </w:r>
       <w:r>
         <w:rPr>
@@ -1512,6 +1546,78 @@
           <w:sz w:val="19"/>
           <w:szCs w:val="19"/>
         </w:rPr>
+        <w:t xml:space="preserve">	sep 2020 – mar 2021</w:t>
+      </w:r>
+    </w:p>
+    <w:p>
+      <w:pPr>
+        <w:keepNext/>
+        <w:spacing w:after="40"/>
+      </w:pPr>
+      <w:r>
+        <w:rPr>
+          <w:color w:val="52525B"/>
+          <w:sz w:val="18"/>
+          <w:szCs w:val="18"/>
+        </w:rPr>
+        <w:t xml:space="preserve">El Poblado, Medellín</w:t>
+      </w:r>
+    </w:p>
+    <w:p>
+      <w:pPr>
+        <w:pStyle w:val="ListParagraph"/>
+        <w:numPr>
+          <w:ilvl w:val="0"/>
+          <w:numId w:val="2"/>
+        </w:numPr>
+        <w:spacing w:after="30"/>
+      </w:pPr>
+      <w:r>
+        <w:rPr>
+          <w:sz w:val="20"/>
+          <w:szCs w:val="20"/>
+        </w:rPr>
+        <w:t xml:space="preserve">Dirigí la operación nocturna de un hotel boutique en su reapertura tras las cuarentenas: recepción, auditoría nocturna, servicio al huésped, seguridad y los sistemas del hotel.</w:t>
+      </w:r>
+    </w:p>
+    <w:p>
+      <w:pPr>
+        <w:spacing w:after="40"/>
+      </w:pPr>
+      <w:r>
+        <w:rPr>
+          <w:i/>
+          <w:iCs/>
+          <w:color w:val="52525B"/>
+          <w:sz w:val="18"/>
+          <w:szCs w:val="18"/>
+        </w:rPr>
+        <w:t xml:space="preserve"/>
+      </w:r>
+    </w:p>
+    <w:p>
+      <w:pPr>
+        <w:keepNext/>
+        <w:tabs>
+          <w:tab w:val="right" w:pos="10080"/>
+        </w:tabs>
+        <w:spacing w:before="140"/>
+      </w:pPr>
+      <w:r>
+        <w:rPr>
+          <w:b/>
+          <w:bCs/>
+          <w:sz w:val="21"/>
+          <w:szCs w:val="21"/>
+        </w:rPr>
+        <w:t xml:space="preserve">Fundador y Gerente General — Negocio hotelero propio</w:t>
+      </w:r>
+      <w:r>
+        <w:rPr>
+          <w:color w:val="52525B"/>
+          <w:sz w:val="19"/>
+          <w:szCs w:val="19"/>
+        </w:rPr>
         <w:t xml:space="preserve">	oct 2013 – mar 2020</w:t>
       </w:r>
     </w:p>
@@ -1560,7 +1666,7 @@
           <w:sz w:val="20"/>
           <w:szCs w:val="20"/>
         </w:rPr>
-        <w:t xml:space="preserve">Responsable de todo el negocio: operación, personal, finanzas y administración, marca y marketing, y distribución en Airbnb y Booking.com.</w:t>
+        <w:t xml:space="preserve">Responsable de todo el negocio: operación, personal, finanzas, marca, marketing y distribución en Airbnb y Booking.com.</w:t>
       </w:r>
     </w:p>
     <w:p>
@@ -1735,7 +1841,7 @@
           <w:sz w:val="20"/>
           <w:szCs w:val="20"/>
         </w:rPr>
-        <w:t xml:space="preserve">EXPERIENCIA ANTERIOR — HOTELERÍA Y TI (2005 – 2013)</w:t>
+        <w:t xml:space="preserve">EXPERIENCIA ANTERIOR (2003 – 2013)</w:t>
       </w:r>
     </w:p>
     <w:p>
@@ -1773,7 +1879,7 @@
           <w:sz w:val="20"/>
           <w:szCs w:val="20"/>
         </w:rPr>
-        <w:t xml:space="preserve">Vinculación corta en soporte de TI y sistemas.</w:t>
+        <w:t xml:space="preserve">Soporte de TI y sistemas.</w:t>
       </w:r>
     </w:p>
     <w:p>
@@ -1791,7 +1897,7 @@
           <w:sz w:val="21"/>
           <w:szCs w:val="21"/>
         </w:rPr>
-        <w:t xml:space="preserve">Auditor Nocturno — Comfort Suites Laureles · San Joaquín · Sky Plus Best Western · Poblado Plaza</w:t>
+        <w:t xml:space="preserve">Recepcionista → Auditor Nocturno → Jefe de Recepción — Affinity / EE Hoteles</w:t>
       </w:r>
       <w:r>
         <w:rPr>
@@ -1799,19 +1905,19 @@
           <w:sz w:val="19"/>
           <w:szCs w:val="19"/>
         </w:rPr>
-        <w:t xml:space="preserve">	2010 – 2011</w:t>
-      </w:r>
-    </w:p>
-    <w:p>
-      <w:pPr>
-        <w:spacing w:after="30"/>
-      </w:pPr>
-      <w:r>
-        <w:rPr>
-          <w:sz w:val="20"/>
-          <w:szCs w:val="20"/>
-        </w:rPr>
-        <w:t xml:space="preserve">Auditoría nocturna, recepción y sistemas hoteleros en varios hoteles de Medellín.</w:t>
+        <w:t xml:space="preserve">	2005 – 2011</w:t>
+      </w:r>
+    </w:p>
+    <w:p>
+      <w:pPr>
+        <w:spacing w:after="30"/>
+      </w:pPr>
+      <w:r>
+        <w:rPr>
+          <w:sz w:val="20"/>
+          <w:szCs w:val="20"/>
+        </w:rPr>
+        <w:t xml:space="preserve">Sedes Affinity, Alcázar de Oviedo, Rodeo y Novelty Suites; luego auditoría en Comfort Suites, San Joaquín, Sky Plus Best Western y Poblado Plaza.</w:t>
       </w:r>
     </w:p>
     <w:p>
@@ -1829,7 +1935,7 @@
           <w:sz w:val="21"/>
           <w:szCs w:val="21"/>
         </w:rPr>
-        <w:t xml:space="preserve">Recepcionista → Auditor Nocturno → Jefe de Recepción — Affinity Aparta Hotel / EE Hoteles</w:t>
+        <w:t xml:space="preserve">Gerente de Oficina — Nueva York — Two Cousins Trucking Corp.</w:t>
       </w:r>
       <w:r>
         <w:rPr>
@@ -1837,19 +1943,19 @@
           <w:sz w:val="19"/>
           <w:szCs w:val="19"/>
         </w:rPr>
-        <w:t xml:space="preserve">	2005 – 2010</w:t>
-      </w:r>
-    </w:p>
-    <w:p>
-      <w:pPr>
-        <w:spacing w:after="30"/>
-      </w:pPr>
-      <w:r>
-        <w:rPr>
-          <w:sz w:val="20"/>
-          <w:szCs w:val="20"/>
-        </w:rPr>
-        <w:t xml:space="preserve">Seis años en las sedes del grupo (Affinity, Alcázar de Oviedo, Rodeo, Novelty Suites y otras): recepción, auditoría nocturna, jefatura de recepción y sistemas hoteleros.</w:t>
+        <w:t xml:space="preserve">	ene 2003 – jun 2005</w:t>
+      </w:r>
+    </w:p>
+    <w:p>
+      <w:pPr>
+        <w:spacing w:after="30"/>
+      </w:pPr>
+      <w:r>
+        <w:rPr>
+          <w:sz w:val="20"/>
+          <w:szCs w:val="20"/>
+        </w:rPr>
+        <w:t xml:space="preserve">Administración, facturación y sistemas de oficina de una transportadora en Nueva York.</w:t>
       </w:r>
     </w:p>
     <w:p>
@@ -2142,7 +2248,7 @@
           <w:sz w:val="20"/>
           <w:szCs w:val="20"/>
         </w:rPr>
-        <w:t xml:space="preserve">Español (Nativo)  ·  Inglés (Profesional (C1))</w:t>
+        <w:t xml:space="preserve">Español — Nativo  ·  Inglés — Profesional (C1)</w:t>
       </w:r>
     </w:p>
     <w:sectPr>

</xml_diff>

<commit_message>
fix(resume): Major Media as a 6-month contract, Mar–Aug 2026
Co-Authored-By: Claude Opus 5.5 <noreply@anthropic.com>
Claude-Session: https://claude.ai/code/session_01LBMvfUQ6YDGZ1wc9D6Yjrn
</commit_message>
<xml_diff>
--- a/public/cv/David-Gomez-Hoja-de-Vida-ES.docx
+++ b/public/cv/David-Gomez-Hoja-de-Vida-ES.docx
@@ -37,7 +37,7 @@
         </w:rPr>
         <w:t xml:space="preserve">Medellín, Colombia · Disponible remoto e híbrido  |  +57 317 853 0602  |  </w:t>
       </w:r>
-      <w:hyperlink w:history="1" r:id="rIdwdynh2xgknurmu6xaunbk">
+      <w:hyperlink w:history="1" r:id="rIdhlio5uhdqmfhlse4tfjzq">
         <w:r>
           <w:rPr>
             <w:rStyle w:val="Hyperlink"/>
@@ -49,7 +49,7 @@
       </w:hyperlink>
     </w:p>
     <w:p>
-      <w:hyperlink w:history="1" r:id="rIdjpfk9q5qzchqzkfc_czdv">
+      <w:hyperlink w:history="1" r:id="rIdplos08osbvlnerwldw4qr">
         <w:r>
           <w:rPr>
             <w:rStyle w:val="Hyperlink"/>
@@ -67,7 +67,7 @@
         </w:rPr>
         <w:t xml:space="preserve">  |  </w:t>
       </w:r>
-      <w:hyperlink w:history="1" r:id="rIdnmqvxezjtc5wr3ymddtzz">
+      <w:hyperlink w:history="1" r:id="rId-i3vmw4eubdozq6mtf0p1">
         <w:r>
           <w:rPr>
             <w:rStyle w:val="Hyperlink"/>
@@ -85,7 +85,7 @@
         </w:rPr>
         <w:t xml:space="preserve">  |  </w:t>
       </w:r>
-      <w:hyperlink w:history="1" r:id="rIdqgorf5doowicsxuu07lqz">
+      <w:hyperlink w:history="1" r:id="rIdh1sed3ovotxsrybeha7oz">
         <w:r>
           <w:rPr>
             <w:rStyle w:val="Hyperlink"/>
@@ -631,7 +631,7 @@
           <w:sz w:val="21"/>
           <w:szCs w:val="21"/>
         </w:rPr>
-        <w:t xml:space="preserve">Desarrollador Full-Stack — WordPress (Contrato) — Major Media</w:t>
+        <w:t xml:space="preserve">Desarrollador Web Full-Stack (Contratista) — Major Media</w:t>
       </w:r>
       <w:r>
         <w:rPr>
@@ -639,7 +639,7 @@
           <w:sz w:val="19"/>
           <w:szCs w:val="19"/>
         </w:rPr>
-        <w:t xml:space="preserve">	2026 · varios meses</w:t>
+        <w:t xml:space="preserve">	mar 2026 – ago 2026</w:t>
       </w:r>
     </w:p>
     <w:p>

</xml_diff>